<commit_message>
fix(templates): bold the proposal SOW total row and document the forced Commercials break
</commit_message>
<xml_diff>
--- a/packages/desktop/resources/presentation-templates/proposal-sow.docx
+++ b/packages/desktop/resources/presentation-templates/proposal-sow.docx
@@ -446,18 +446,33 @@
       <w:tr>
         <w:trPr/>
         <w:tc>
-          <w:p>
-            <w:r>
+          <w:tcPr/>
+          <w:p>
+            <w:r>
+              <w:rPr>
+                <w:b/>
+              </w:rPr>
               <w:t xml:space="preserve">Total</w:t>
             </w:r>
           </w:p>
         </w:tc>
         <w:tc>
-          <w:p/>
-        </w:tc>
-        <w:tc>
-          <w:p>
-            <w:r>
+          <w:tcPr/>
+          <w:p>
+            <w:pPr>
+              <w:rPr>
+                <w:b/>
+              </w:rPr>
+            </w:pPr>
+          </w:p>
+        </w:tc>
+        <w:tc>
+          <w:tcPr/>
+          <w:p>
+            <w:r>
+              <w:rPr>
+                <w:b/>
+              </w:rPr>
               <w:t xml:space="preserve">284,000</w:t>
             </w:r>
           </w:p>

</xml_diff>